<commit_message>
Revise Graefe package: separate tables/figures, Table 1–5 from original, Fig3 Frangi/skeleton, Response and submission_package_20260731.
Co-authored-by: Cursor <cursoragent@cursor.com>
</commit_message>
<xml_diff>
--- a/documentation/graefe_revision/Response_to_Reviewers_DRAFT.docx
+++ b/documentation/graefe_revision/Response_to_Reviewers_DRAFT.docx
@@ -2,7 +2,7 @@
 <file path=word/document.xml><?xml version="1.0" encoding="utf-8"?>
 <w:document xmlns:w="http://schemas.openxmlformats.org/wordprocessingml/2006/main" xmlns:m="http://schemas.openxmlformats.org/officeDocument/2006/math" xmlns:r="http://schemas.openxmlformats.org/officeDocument/2006/relationships" xmlns:o="urn:schemas-microsoft-com:office:office" xmlns:v="urn:schemas-microsoft-com:vml" xmlns:w10="urn:schemas-microsoft-com:office:word" xmlns:a="http://schemas.openxmlformats.org/drawingml/2006/main" xmlns:pic="http://schemas.openxmlformats.org/drawingml/2006/picture" xmlns:wp="http://schemas.openxmlformats.org/drawingml/2006/wordprocessingDrawing">
   <w:body>
-    <w:bookmarkStart w:id="24" w:name="point-by-point-response-to-reviewers"/>
+    <w:bookmarkStart w:id="23" w:name="point-by-point-response-to-reviewers"/>
     <w:p>
       <w:pPr>
         <w:pStyle w:val="Heading1"/>
@@ -58,7 +58,7 @@
         <w:t xml:space="preserve"> </w:t>
       </w:r>
       <w:r>
-        <w:t xml:space="preserve">Novel Semi-Automated System for Multi-Dimensional Analysis of Macular Neovascularization: A Comparative Study of Quantitative Biomarkers and Morphological-Pathophysiological Classification</w:t>
+        <w:t xml:space="preserve">Novel Semi-Automated System for Multi-Dimensional Analysis of Macular Neovascularization: Quantitative Biomarkers and Rule-Based Morphological Categorization Across OCTA Platforms</w:t>
       </w:r>
       <w:r>
         <w:br/>
@@ -258,13 +258,100 @@
         <w:t xml:space="preserve"> </w:t>
       </w:r>
       <w:r>
-        <w:t xml:space="preserve">2. Softened language regarding “pathophysiological classification” and clinical decision-making (see Reviewer 2, Comment 3).</w:t>
-      </w:r>
-      <w:r>
-        <w:t xml:space="preserve"> </w:t>
-      </w:r>
-      <w:r>
-        <w:t xml:space="preserve">3. Expanded the Limitations section to address circularity of median-anchored normalization, absence of longitudinal clinical anchors, anonymized cohort without detailed baseline demographics, reproducibility scope (multi-rater inter-observer primary; intra-observer optional if available), and the need for multi-center external validation.</w:t>
+        <w:t xml:space="preserve">2. Softened language regarding “pathophysiological classification” and clinical decision-making (see Reviewer 2, Comment 3);</w:t>
+      </w:r>
+      <w:r>
+        <w:t xml:space="preserve"> </w:t>
+      </w:r>
+      <w:r>
+        <w:rPr>
+          <w:b/>
+          <w:bCs/>
+        </w:rPr>
+        <w:t xml:space="preserve">Tables 4–5</w:t>
+      </w:r>
+      <w:r>
+        <w:t xml:space="preserve"> </w:t>
+      </w:r>
+      <w:r>
+        <w:t xml:space="preserve">rewritten accordingly.</w:t>
+      </w:r>
+      <w:r>
+        <w:t xml:space="preserve"> </w:t>
+      </w:r>
+      <w:r>
+        <w:t xml:space="preserve">3. Expanded the Limitations section to address circularity of median-anchored normalization, absence of longitudinal clinical anchors, anonymized cohort without detailed baseline demographics, reproducibility scope (multi-rater inter-observer primary, with same-operator intra-observer test–retest as a supplement; see Reviewer 2, Comment 4), and the need for multi-center external validation.</w:t>
+      </w:r>
+      <w:r>
+        <w:t xml:space="preserve"> </w:t>
+      </w:r>
+      <w:r>
+        <w:t xml:space="preserve">4. Restored and notation-revised</w:t>
+      </w:r>
+      <w:r>
+        <w:t xml:space="preserve"> </w:t>
+      </w:r>
+      <w:r>
+        <w:rPr>
+          <w:b/>
+          <w:bCs/>
+        </w:rPr>
+        <w:t xml:space="preserve">Tables 1–5</w:t>
+      </w:r>
+      <w:r>
+        <w:t xml:space="preserve"> </w:t>
+      </w:r>
+      <w:r>
+        <w:t xml:space="preserve">from the original submission tables file (see Reviewer 2 Comments 1, 3, 5, 7). Tables are provided as a</w:t>
+      </w:r>
+      <w:r>
+        <w:t xml:space="preserve"> </w:t>
+      </w:r>
+      <w:r>
+        <w:rPr>
+          <w:b/>
+          <w:bCs/>
+        </w:rPr>
+        <w:t xml:space="preserve">separate Word file</w:t>
+      </w:r>
+      <w:r>
+        <w:t xml:space="preserve"> </w:t>
+      </w:r>
+      <w:r>
+        <w:t xml:space="preserve">(</w:t>
+      </w:r>
+      <w:r>
+        <w:rPr>
+          <w:rStyle w:val="VerbatimChar"/>
+        </w:rPr>
+        <w:t xml:space="preserve">MNV_Analysis_YY_rev1_tables.docx</w:t>
+      </w:r>
+      <w:r>
+        <w:t xml:space="preserve">, corresponding to the original</w:t>
+      </w:r>
+      <w:r>
+        <w:t xml:space="preserve"> </w:t>
+      </w:r>
+      <w:r>
+        <w:rPr>
+          <w:rStyle w:val="VerbatimChar"/>
+        </w:rPr>
+        <w:t xml:space="preserve">MNV_analysis_tables.docx</w:t>
+      </w:r>
+      <w:r>
+        <w:t xml:space="preserve"> </w:t>
+      </w:r>
+      <w:r>
+        <w:t xml:space="preserve">packaging); the manuscript body cites Tables 1–5 in text only. Figure legends for Figures 1–3 are likewise in a separate file (</w:t>
+      </w:r>
+      <w:r>
+        <w:rPr>
+          <w:rStyle w:val="VerbatimChar"/>
+        </w:rPr>
+        <w:t xml:space="preserve">MNV_Analysis_YY_rev1_figure_legends.docx</w:t>
+      </w:r>
+      <w:r>
+        <w:t xml:space="preserve">).</w:t>
       </w:r>
     </w:p>
     <w:p>
@@ -478,39 +565,20 @@
         <w:br/>
       </w:r>
       <w:r>
-        <w:t xml:space="preserve">We agree without reservation. Mapping each stratum’s median to 50 is by construction; therefore median values near 50 after normalization cannot be interpreted as empirical proof of biological equivalence across devices. Indeed, re-analysis of the primary batch CSVs (n = 112) shows that, despite median-anchored scaling,</w:t>
-      </w:r>
-      <w:r>
-        <w:t xml:space="preserve"> </w:t>
-      </w:r>
-      <w:r>
-        <w:rPr>
-          <w:b/>
-          <w:bCs/>
-        </w:rPr>
-        <w:t xml:space="preserve">Caliber Uniformity Score</w:t>
-      </w:r>
-      <w:r>
-        <w:t xml:space="preserve"> </w:t>
-      </w:r>
-      <w:r>
-        <w:t xml:space="preserve">and</w:t>
-      </w:r>
-      <w:r>
-        <w:t xml:space="preserve"> </w:t>
-      </w:r>
-      <w:r>
-        <w:rPr>
-          <w:b/>
-          <w:bCs/>
-        </w:rPr>
-        <w:t xml:space="preserve">Maturity Index</w:t>
-      </w:r>
-      <w:r>
-        <w:t xml:space="preserve"> </w:t>
-      </w:r>
-      <w:r>
-        <w:t xml:space="preserve">retain significant between-stratum differences with non-negligible effect sizes (see Comment 5). This strengthens the Reviewer’s point: medians near 50 are a mathematical consequence of the transform and do</w:t>
+        <w:t xml:space="preserve">We agree without reservation. Mapping each stratum’s median to 50 is by construction; therefore median values near 50 after normalization cannot be interpreted as empirical proof of biological equivalence across devices. Under the</w:t>
+      </w:r>
+      <w:r>
+        <w:t xml:space="preserve"> </w:t>
+      </w:r>
+      <w:r>
+        <w:rPr>
+          <w:b/>
+          <w:bCs/>
+        </w:rPr>
+        <w:t xml:space="preserve">default Standardized Caliber Uniformity Score</w:t>
+      </w:r>
+      <w:r>
+        <w:t xml:space="preserve">, between-stratum Kruskal–Wallis tests for Complexity, Caliber, and Maturity are non-significant (ε² ≈ 0; see Comment 5)—but that pattern still does</w:t>
       </w:r>
       <w:r>
         <w:t xml:space="preserve"> </w:t>
@@ -526,6 +594,35 @@
         <w:t xml:space="preserve"> </w:t>
       </w:r>
       <w:r>
+        <w:t xml:space="preserve">establish biological equivalence, because median-anchored transforms and locked cuts can attenuate stratum-mean contrasts by design. Under the</w:t>
+      </w:r>
+      <w:r>
+        <w:t xml:space="preserve"> </w:t>
+      </w:r>
+      <w:r>
+        <w:rPr>
+          <w:b/>
+          <w:bCs/>
+        </w:rPr>
+        <w:t xml:space="preserve">PCA-based Caliber Uniformity Score (legacy)</w:t>
+      </w:r>
+      <w:r>
+        <w:t xml:space="preserve">, Caliber and Maturity had retained significant between-stratum differences (ε² ≈ 0.24); that legacy finding is reported only as sensitivity context. In all cases, medians near 50 are a mathematical consequence of the transform and do</w:t>
+      </w:r>
+      <w:r>
+        <w:t xml:space="preserve"> </w:t>
+      </w:r>
+      <w:r>
+        <w:rPr>
+          <w:b/>
+          <w:bCs/>
+        </w:rPr>
+        <w:t xml:space="preserve">not</w:t>
+      </w:r>
+      <w:r>
+        <w:t xml:space="preserve"> </w:t>
+      </w:r>
+      <w:r>
         <w:t xml:space="preserve">imply that scores are biologically comparable across devices/FOV strata.</w:t>
       </w:r>
     </w:p>
@@ -544,7 +641,7 @@
         <w:t xml:space="preserve"> </w:t>
       </w:r>
       <w:r>
-        <w:t xml:space="preserve">- Abstract, Results (“Convergence of Standardized Scores…”), and Discussion have been rewritten to state that piecewise-linear normalization is a</w:t>
+        <w:t xml:space="preserve">- Abstract, Results (“Stratum-Standardized Scores…”), and Discussion have been rewritten to state that piecewise-linear normalization is a</w:t>
       </w:r>
       <w:r>
         <w:t xml:space="preserve"> </w:t>
@@ -588,6 +685,44 @@
         <w:t xml:space="preserve"> </w:t>
       </w:r>
       <w:r>
+        <w:t xml:space="preserve">-</w:t>
+      </w:r>
+      <w:r>
+        <w:t xml:space="preserve"> </w:t>
+      </w:r>
+      <w:r>
+        <w:rPr>
+          <w:b/>
+          <w:bCs/>
+        </w:rPr>
+        <w:t xml:space="preserve">Table 3</w:t>
+      </w:r>
+      <w:r>
+        <w:t xml:space="preserve"> </w:t>
+      </w:r>
+      <w:r>
+        <w:t xml:space="preserve">rewritten: primary endpoint is now the</w:t>
+      </w:r>
+      <w:r>
+        <w:t xml:space="preserve"> </w:t>
+      </w:r>
+      <w:r>
+        <w:rPr>
+          <w:b/>
+          <w:bCs/>
+        </w:rPr>
+        <w:t xml:space="preserve">default</w:t>
+      </w:r>
+      <w:r>
+        <w:t xml:space="preserve"> </w:t>
+      </w:r>
+      <w:r>
+        <w:t xml:space="preserve">Standardized Caliber Uniformity Score with Kruskal–Wallis H/p plus ε² and bootstrap 95% CIs (medians 46.6 / 55.5 / 50.6 for Caliber; Complexity PC1 explained variance retained in prose). Original PCA-Caliber Table 3 medians/p-values are no longer the primary table content.</w:t>
+      </w:r>
+      <w:r>
+        <w:t xml:space="preserve"> </w:t>
+      </w:r>
+      <w:r>
         <w:t xml:space="preserve">- Retained and clarified the non-circular elements that remain informative: (i) large between-device differences in</w:t>
       </w:r>
       <w:r>
@@ -604,7 +739,17 @@
         <w:t xml:space="preserve"> </w:t>
       </w:r>
       <w:r>
-        <w:t xml:space="preserve">metrics (Table 2); (ii) consistency of PCA structure (PC1 loadings and explained variance) across strata; (iii) within-stratum score distributions by morphological category after expert comparison (revised analyses).</w:t>
+        <w:t xml:space="preserve">metrics (</w:t>
+      </w:r>
+      <w:r>
+        <w:rPr>
+          <w:b/>
+          <w:bCs/>
+        </w:rPr>
+        <w:t xml:space="preserve">Table 2</w:t>
+      </w:r>
+      <w:r>
+        <w:t xml:space="preserve">, restored from original submission numbers with Optovue labeling); (ii) consistency of PCA structure (PC1 loadings and explained variance) across strata; (iii) within-stratum score distributions by morphological category after expert comparison (revised analyses).</w:t>
       </w:r>
       <w:r>
         <w:t xml:space="preserve"> </w:t>
@@ -1092,6 +1237,46 @@
           <w:b/>
           <w:bCs/>
         </w:rPr>
+        <w:t xml:space="preserve">Changes made (tables):</w:t>
+      </w:r>
+      <w:r>
+        <w:t xml:space="preserve"> </w:t>
+      </w:r>
+      <w:r>
+        <w:t xml:space="preserve">-</w:t>
+      </w:r>
+      <w:r>
+        <w:t xml:space="preserve"> </w:t>
+      </w:r>
+      <w:r>
+        <w:rPr>
+          <w:b/>
+          <w:bCs/>
+        </w:rPr>
+        <w:t xml:space="preserve">Table 4</w:t>
+      </w:r>
+      <w:r>
+        <w:t xml:space="preserve"> </w:t>
+      </w:r>
+      <w:r>
+        <w:t xml:space="preserve">restored from the original submission tables file with complete Medusa/Seafan splits (large Medusa 6 [12.2%]; small Seafan 2 [6.1%]; small_3mm Seafan 11 [36.7%]); expert–automated κ and Supplementary confusion matrix added in Results (not as a numbered main-text table).</w:t>
+      </w:r>
+      <w:r>
+        <w:t xml:space="preserve"> </w:t>
+      </w:r>
+      <w:r>
+        <w:t xml:space="preserve">- Decision thresholds disclosed in Methods / Supplementary Table S1.</w:t>
+      </w:r>
+    </w:p>
+    <w:p>
+      <w:pPr>
+        <w:pStyle w:val="BodyText"/>
+      </w:pPr>
+      <w:r>
+        <w:rPr>
+          <w:b/>
+          <w:bCs/>
+        </w:rPr>
         <w:t xml:space="preserve">Selected references (Comment 2):</w:t>
       </w:r>
       <w:r>
@@ -1267,6 +1452,66 @@
         <w:t xml:space="preserve"> </w:t>
       </w:r>
       <w:r>
+        <w:t xml:space="preserve">-</w:t>
+      </w:r>
+      <w:r>
+        <w:t xml:space="preserve"> </w:t>
+      </w:r>
+      <w:r>
+        <w:rPr>
+          <w:b/>
+          <w:bCs/>
+        </w:rPr>
+        <w:t xml:space="preserve">Table 4:</w:t>
+      </w:r>
+      <w:r>
+        <w:t xml:space="preserve"> </w:t>
+      </w:r>
+      <w:r>
+        <w:t xml:space="preserve">removed the original “Pathophysiological State” column; subtype counts/percentages restored from the original tables file (including Medusa/Seafan splits).</w:t>
+      </w:r>
+      <w:r>
+        <w:t xml:space="preserve"> </w:t>
+      </w:r>
+      <w:r>
+        <w:t xml:space="preserve">-</w:t>
+      </w:r>
+      <w:r>
+        <w:t xml:space="preserve"> </w:t>
+      </w:r>
+      <w:r>
+        <w:rPr>
+          <w:b/>
+          <w:bCs/>
+        </w:rPr>
+        <w:t xml:space="preserve">Table 5:</w:t>
+      </w:r>
+      <w:r>
+        <w:t xml:space="preserve"> </w:t>
+      </w:r>
+      <w:r>
+        <w:t xml:space="preserve">retitled/rewritten as a morphology-derived interpretive mapping (Primary/Secondary</w:t>
+      </w:r>
+      <w:r>
+        <w:t xml:space="preserve"> </w:t>
+      </w:r>
+      <w:r>
+        <w:rPr>
+          <w:b/>
+          <w:bCs/>
+        </w:rPr>
+        <w:t xml:space="preserve">interpretive category</w:t>
+      </w:r>
+      <w:r>
+        <w:t xml:space="preserve"> </w:t>
+      </w:r>
+      <w:r>
+        <w:t xml:space="preserve">columns); no pathophysiological-state wording.</w:t>
+      </w:r>
+      <w:r>
+        <w:t xml:space="preserve"> </w:t>
+      </w:r>
+      <w:r>
         <w:t xml:space="preserve">- Explicitly state that these labels are</w:t>
       </w:r>
       <w:r>
@@ -1403,7 +1648,20 @@
         <w:t xml:space="preserve"> </w:t>
       </w:r>
       <w:r>
-        <w:t xml:space="preserve">(two-way random-effects, absolute agreement, single measures — ICC(2,1); Shrout &amp; Fleiss / McGraw &amp; Wong) for lesion area and for Network Complexity Score, Caliber Uniformity Score, and Maturity Index, with pairwise ICCs and a multilevel variance-component ICC as complementary summaries.</w:t>
+        <w:t xml:space="preserve">(two-way random-effects, absolute agreement, single measures — ICC(2,1); Shrout &amp; Fleiss; McGraw &amp; Wong) for lesion area and for Network Complexity Score, the</w:t>
+      </w:r>
+      <w:r>
+        <w:t xml:space="preserve"> </w:t>
+      </w:r>
+      <w:r>
+        <w:rPr>
+          <w:b/>
+          <w:bCs/>
+        </w:rPr>
+        <w:t xml:space="preserve">default Standardized Caliber Uniformity Score</w:t>
+      </w:r>
+      <w:r>
+        <w:t xml:space="preserve">, and Maturity Index recomputed from that Caliber score, with pairwise ICCs and a multilevel variance-component ICC as complementary summaries. Interpretive bands follow published guidance (poor &lt;0.50; moderate 0.50–0.75; good 0.75–0.90; excellent &gt;0.90; Koo &amp; Li).</w:t>
       </w:r>
     </w:p>
     <w:p>
@@ -1411,23 +1669,76 @@
         <w:pStyle w:val="BodyText"/>
       </w:pPr>
       <w:r>
-        <w:rPr>
-          <w:b/>
-          <w:bCs/>
-        </w:rPr>
-        <w:t xml:space="preserve">Primary results (3-rater ICC(2,1), n = 46):</w:t>
+        <w:t xml:space="preserve">In the revised manuscript, the</w:t>
+      </w:r>
+      <w:r>
+        <w:t xml:space="preserve"> </w:t>
+      </w:r>
+      <w:r>
+        <w:rPr>
+          <w:b/>
+          <w:bCs/>
+        </w:rPr>
+        <w:t xml:space="preserve">default / primary Caliber Uniformity endpoint</w:t>
+      </w:r>
+      <w:r>
+        <w:t xml:space="preserve"> </w:t>
+      </w:r>
+      <w:r>
+        <w:t xml:space="preserve">is the device-/stratum-locked score based on NV Diameter CV and Dilated vessel % (weights 0.75 / 0.25; stratum-locked min/median/max piecewise maps; CIRRUS/</w:t>
+      </w:r>
+      <w:r>
+        <w:rPr>
+          <w:rStyle w:val="VerbatimChar"/>
+        </w:rPr>
+        <w:t xml:space="preserve">small_3mm</w:t>
+      </w:r>
+      <w:r>
+        <w:t xml:space="preserve"> </w:t>
+      </w:r>
+      <w:r>
+        <w:t xml:space="preserve">locked cuts on this ICC set). The</w:t>
+      </w:r>
+      <w:r>
+        <w:t xml:space="preserve"> </w:t>
+      </w:r>
+      <w:r>
+        <w:rPr>
+          <w:b/>
+          <w:bCs/>
+        </w:rPr>
+        <w:t xml:space="preserve">PCA-based Caliber Uniformity Score (legacy)</w:t>
+      </w:r>
+      <w:r>
+        <w:t xml:space="preserve"> </w:t>
+      </w:r>
+      <w:r>
+        <w:t xml:space="preserve">from the original submission is retained only as a sensitivity comparison.</w:t>
+      </w:r>
+    </w:p>
+    <w:p>
+      <w:pPr>
+        <w:pStyle w:val="BodyText"/>
+      </w:pPr>
+      <w:r>
+        <w:rPr>
+          <w:b/>
+          <w:bCs/>
+        </w:rPr>
+        <w:t xml:space="preserve">Primary results (3-rater ICC(2,1), n = 46; default Caliber definition):</w:t>
       </w:r>
     </w:p>
     <w:tbl>
       <w:tblPr>
         <w:tblStyle w:val="Table"/>
-        <w:tblW w:type="auto" w:w="0"/>
+        <w:tblW w:type="pct" w:w="5000"/>
+        <w:tblLayout w:type="fixed"/>
         <w:tblLook w:firstRow="1" w:lastRow="0" w:firstColumn="0" w:lastColumn="0" w:noHBand="0" w:noVBand="0" w:val="0020"/>
       </w:tblPr>
       <w:tblGrid>
-        <w:gridCol w:w="2640"/>
-        <w:gridCol w:w="2640"/>
-        <w:gridCol w:w="2640"/>
+        <w:gridCol w:w="2436"/>
+        <w:gridCol w:w="3046"/>
+        <w:gridCol w:w="2436"/>
       </w:tblGrid>
       <w:tr>
         <w:trPr>
@@ -1545,29 +1856,29 @@
               <w:pStyle w:val="Compact"/>
             </w:pPr>
             <w:r>
-              <w:t xml:space="preserve">Caliber Uniformity Score</w:t>
-            </w:r>
-          </w:p>
-        </w:tc>
-        <w:tc>
-          <w:tcPr/>
-          <w:p>
-            <w:pPr>
-              <w:pStyle w:val="Compact"/>
-            </w:pPr>
-            <w:r>
-              <w:t xml:space="preserve">0.434</w:t>
-            </w:r>
-          </w:p>
-        </w:tc>
-        <w:tc>
-          <w:tcPr/>
-          <w:p>
-            <w:pPr>
-              <w:pStyle w:val="Compact"/>
-            </w:pPr>
-            <w:r>
-              <w:t xml:space="preserve">0.260–0.610</w:t>
+              <w:t xml:space="preserve">Caliber Uniformity Score (default, device-locked)</w:t>
+            </w:r>
+          </w:p>
+        </w:tc>
+        <w:tc>
+          <w:tcPr/>
+          <w:p>
+            <w:pPr>
+              <w:pStyle w:val="Compact"/>
+            </w:pPr>
+            <w:r>
+              <w:t xml:space="preserve">0.770</w:t>
+            </w:r>
+          </w:p>
+        </w:tc>
+        <w:tc>
+          <w:tcPr/>
+          <w:p>
+            <w:pPr>
+              <w:pStyle w:val="Compact"/>
+            </w:pPr>
+            <w:r>
+              <w:t xml:space="preserve">0.660–0.860</w:t>
             </w:r>
           </w:p>
         </w:tc>
@@ -1580,29 +1891,29 @@
               <w:pStyle w:val="Compact"/>
             </w:pPr>
             <w:r>
-              <w:t xml:space="preserve">Maturity Index</w:t>
-            </w:r>
-          </w:p>
-        </w:tc>
-        <w:tc>
-          <w:tcPr/>
-          <w:p>
-            <w:pPr>
-              <w:pStyle w:val="Compact"/>
-            </w:pPr>
-            <w:r>
-              <w:t xml:space="preserve">0.659</w:t>
-            </w:r>
-          </w:p>
-        </w:tc>
-        <w:tc>
-          <w:tcPr/>
-          <w:p>
-            <w:pPr>
-              <w:pStyle w:val="Compact"/>
-            </w:pPr>
-            <w:r>
-              <w:t xml:space="preserve">0.510–0.780</w:t>
+              <w:t xml:space="preserve">Maturity Index (from default Caliber)</w:t>
+            </w:r>
+          </w:p>
+        </w:tc>
+        <w:tc>
+          <w:tcPr/>
+          <w:p>
+            <w:pPr>
+              <w:pStyle w:val="Compact"/>
+            </w:pPr>
+            <w:r>
+              <w:t xml:space="preserve">0.593</w:t>
+            </w:r>
+          </w:p>
+        </w:tc>
+        <w:tc>
+          <w:tcPr/>
+          <w:p>
+            <w:pPr>
+              <w:pStyle w:val="Compact"/>
+            </w:pPr>
+            <w:r>
+              <w:t xml:space="preserve">0.430–0.730</w:t>
             </w:r>
           </w:p>
         </w:tc>
@@ -1613,7 +1924,36 @@
         <w:pStyle w:val="BodyText"/>
       </w:pPr>
       <w:r>
-        <w:t xml:space="preserve">Lesion area and Network Complexity showed good-to-excellent inter-observer agreement; Maturity Index showed moderate-to-good agreement; Caliber Uniformity was moderate and more sensitive to ROI variability. Variance-component ICC_case (σ²_case / [σ²_case + σ²_observer + σ²_error]) yielded the same point estimates (0.859 / 0.807 / 0.434 / 0.659), indicating that residual and observer components together explain the remaining variance—largest for Caliber Uniformity.</w:t>
+        <w:t xml:space="preserve">Lesion area, Network Complexity, and the default Standardized Caliber Uniformity Score showed</w:t>
+      </w:r>
+      <w:r>
+        <w:t xml:space="preserve"> </w:t>
+      </w:r>
+      <w:r>
+        <w:rPr>
+          <w:b/>
+          <w:bCs/>
+        </w:rPr>
+        <w:t xml:space="preserve">good</w:t>
+      </w:r>
+      <w:r>
+        <w:t xml:space="preserve"> </w:t>
+      </w:r>
+      <w:r>
+        <w:t xml:space="preserve">inter-observer agreement on conventional ICC benchmarks; Maturity Index derived from that Caliber score was</w:t>
+      </w:r>
+      <w:r>
+        <w:t xml:space="preserve"> </w:t>
+      </w:r>
+      <w:r>
+        <w:rPr>
+          <w:b/>
+          <w:bCs/>
+        </w:rPr>
+        <w:t xml:space="preserve">moderate</w:t>
+      </w:r>
+      <w:r>
+        <w:t xml:space="preserve">. Variance-component ICC_case yielded the same point estimates for these primary endpoints.</w:t>
       </w:r>
     </w:p>
     <w:p>
@@ -1621,19 +1961,87 @@
         <w:pStyle w:val="BodyText"/>
       </w:pPr>
       <w:r>
-        <w:t xml:space="preserve">As a sensitivity analysis on the 20 most cross-observer–concordant cases (lowest mean z-scored rater range across metrics), ICC(2,1) was 0.864 / 0.950 / 0.852 / 0.924 for area / complexity / caliber uniformity / maturity (details:</w:t>
-      </w:r>
-      <w:r>
-        <w:t xml:space="preserve"> </w:t>
-      </w:r>
-      <w:r>
-        <w:rPr>
-          <w:rStyle w:val="VerbatimChar"/>
-        </w:rPr>
-        <w:t xml:space="preserve">icc/icc_multirater_results_subset20.md</w:t>
-      </w:r>
-      <w:r>
-        <w:t xml:space="preserve">); these do not replace the primary n=46 estimates above.</w:t>
+        <w:t xml:space="preserve">We thank the Reviewer for prompting this closer examination of metric-specific reproducibility. Under the legacy PCA Caliber definition, concordance was poorer and more ROI-sensitive. Prior OCTA work has shown that quantitative vascular metrics are often</w:t>
+      </w:r>
+      <w:r>
+        <w:t xml:space="preserve"> </w:t>
+      </w:r>
+      <w:r>
+        <w:rPr>
+          <w:b/>
+          <w:bCs/>
+        </w:rPr>
+        <w:t xml:space="preserve">not interchangeable across OCTA devices/algorithms</w:t>
+      </w:r>
+      <w:r>
+        <w:t xml:space="preserve"> </w:t>
+      </w:r>
+      <w:r>
+        <w:t xml:space="preserve">without device-aware reporting (Corvi et al.,</w:t>
+      </w:r>
+      <w:r>
+        <w:t xml:space="preserve"> </w:t>
+      </w:r>
+      <w:r>
+        <w:rPr>
+          <w:i/>
+          <w:iCs/>
+        </w:rPr>
+        <w:t xml:space="preserve">Am J Ophthalmol</w:t>
+      </w:r>
+      <w:r>
+        <w:t xml:space="preserve"> </w:t>
+      </w:r>
+      <w:r>
+        <w:t xml:space="preserve">2018; Corvi et al.,</w:t>
+      </w:r>
+      <w:r>
+        <w:t xml:space="preserve"> </w:t>
+      </w:r>
+      <w:r>
+        <w:rPr>
+          <w:i/>
+          <w:iCs/>
+        </w:rPr>
+        <w:t xml:space="preserve">Retina</w:t>
+      </w:r>
+      <w:r>
+        <w:t xml:space="preserve"> </w:t>
+      </w:r>
+      <w:r>
+        <w:t xml:space="preserve">2020; consistent with Munk et al.,</w:t>
+      </w:r>
+      <w:r>
+        <w:t xml:space="preserve"> </w:t>
+      </w:r>
+      <w:r>
+        <w:rPr>
+          <w:i/>
+          <w:iCs/>
+        </w:rPr>
+        <w:t xml:space="preserve">PLOS ONE</w:t>
+      </w:r>
+      <w:r>
+        <w:t xml:space="preserve"> </w:t>
+      </w:r>
+      <w:r>
+        <w:t xml:space="preserve">2017, already cited). In the present manuscript, Caliber Uniformity is handled as a</w:t>
+      </w:r>
+      <w:r>
+        <w:t xml:space="preserve"> </w:t>
+      </w:r>
+      <w:r>
+        <w:rPr>
+          <w:b/>
+          <w:bCs/>
+        </w:rPr>
+        <w:t xml:space="preserve">stratum-/device-specific</w:t>
+      </w:r>
+      <w:r>
+        <w:t xml:space="preserve"> </w:t>
+      </w:r>
+      <w:r>
+        <w:t xml:space="preserve">construct (Zeiss PlexElite 6×6 mm; Zeiss CIRRUS AngioPlex 3×3 mm; Optovue Solix 6×6 mm), with locked reference cuts disclosed in Methods and Supplementary Table S1.</w:t>
       </w:r>
     </w:p>
     <w:p>
@@ -1645,13 +2053,650 @@
           <w:b/>
           <w:bCs/>
         </w:rPr>
-        <w:t xml:space="preserve">Intra-observer</w:t>
-      </w:r>
-      <w:r>
-        <w:t xml:space="preserve"> </w:t>
-      </w:r>
-      <w:r>
-        <w:t xml:space="preserve">(same-operator test–retest) reproducibility was not completed within the revision timeline and is acknowledged as a limitation; the primary reproducibility claim for this revision is the three-observer inter-observer ICC above.</w:t>
+        <w:t xml:space="preserve">Sensitivity (same n = 46; disclosed alternate Caliber scores):</w:t>
+      </w:r>
+    </w:p>
+    <w:tbl>
+      <w:tblPr>
+        <w:tblStyle w:val="Table"/>
+        <w:tblW w:type="pct" w:w="5000"/>
+        <w:tblLayout w:type="fixed"/>
+        <w:tblLook w:firstRow="1" w:lastRow="0" w:firstColumn="0" w:lastColumn="0" w:noHBand="0" w:noVBand="0" w:val="0020"/>
+      </w:tblPr>
+      <w:tblGrid>
+        <w:gridCol w:w="1179"/>
+        <w:gridCol w:w="3707"/>
+        <w:gridCol w:w="1685"/>
+        <w:gridCol w:w="1348"/>
+      </w:tblGrid>
+      <w:tr>
+        <w:trPr>
+          <w:tblHeader w:val="on"/>
+        </w:trPr>
+        <w:tc>
+          <w:tcPr/>
+          <w:p>
+            <w:pPr>
+              <w:pStyle w:val="Compact"/>
+            </w:pPr>
+            <w:r>
+              <w:t xml:space="preserve">Score</w:t>
+            </w:r>
+          </w:p>
+        </w:tc>
+        <w:tc>
+          <w:tcPr/>
+          <w:p>
+            <w:pPr>
+              <w:pStyle w:val="Compact"/>
+            </w:pPr>
+            <w:r>
+              <w:t xml:space="preserve">Definition (summary)</w:t>
+            </w:r>
+          </w:p>
+        </w:tc>
+        <w:tc>
+          <w:tcPr/>
+          <w:p>
+            <w:pPr>
+              <w:pStyle w:val="Compact"/>
+            </w:pPr>
+            <w:r>
+              <w:t xml:space="preserve">ICC(2,1)</w:t>
+            </w:r>
+          </w:p>
+        </w:tc>
+        <w:tc>
+          <w:tcPr/>
+          <w:p>
+            <w:pPr>
+              <w:pStyle w:val="Compact"/>
+            </w:pPr>
+            <w:r>
+              <w:t xml:space="preserve">95% CI</w:t>
+            </w:r>
+          </w:p>
+        </w:tc>
+      </w:tr>
+      <w:tr>
+        <w:tc>
+          <w:tcPr/>
+          <w:p>
+            <w:pPr>
+              <w:pStyle w:val="Compact"/>
+            </w:pPr>
+            <w:r>
+              <w:t xml:space="preserve">PCA-based Caliber Uniformity Score (legacy)</w:t>
+            </w:r>
+          </w:p>
+        </w:tc>
+        <w:tc>
+          <w:tcPr/>
+          <w:p>
+            <w:pPr>
+              <w:pStyle w:val="Compact"/>
+            </w:pPr>
+            <w:r>
+              <w:t xml:space="preserve">Prior PCA Stability composite (original submission primary)</w:t>
+            </w:r>
+          </w:p>
+        </w:tc>
+        <w:tc>
+          <w:tcPr/>
+          <w:p>
+            <w:pPr>
+              <w:pStyle w:val="Compact"/>
+            </w:pPr>
+            <w:r>
+              <w:rPr>
+                <w:b/>
+                <w:bCs/>
+              </w:rPr>
+              <w:t xml:space="preserve">0.434</w:t>
+            </w:r>
+          </w:p>
+        </w:tc>
+        <w:tc>
+          <w:tcPr/>
+          <w:p>
+            <w:pPr>
+              <w:pStyle w:val="Compact"/>
+            </w:pPr>
+            <w:r>
+              <w:t xml:space="preserve">0.260–0.610</w:t>
+            </w:r>
+          </w:p>
+        </w:tc>
+      </w:tr>
+      <w:tr>
+        <w:tc>
+          <w:tcPr/>
+          <w:p>
+            <w:pPr>
+              <w:pStyle w:val="Compact"/>
+            </w:pPr>
+            <w:r>
+              <w:t xml:space="preserve">Robust CV proxy</w:t>
+            </w:r>
+          </w:p>
+        </w:tc>
+        <w:tc>
+          <w:tcPr/>
+          <w:p>
+            <w:pPr>
+              <w:pStyle w:val="Compact"/>
+            </w:pPr>
+            <w:r>
+              <w:t xml:space="preserve">Winsorized NV Diameter CV → inverted 0–100</w:t>
+            </w:r>
+          </w:p>
+        </w:tc>
+        <w:tc>
+          <w:tcPr/>
+          <w:p>
+            <w:pPr>
+              <w:pStyle w:val="Compact"/>
+            </w:pPr>
+            <w:r>
+              <w:rPr>
+                <w:b/>
+                <w:bCs/>
+              </w:rPr>
+              <w:t xml:space="preserve">0.765</w:t>
+            </w:r>
+          </w:p>
+        </w:tc>
+        <w:tc>
+          <w:tcPr/>
+          <w:p>
+            <w:pPr>
+              <w:pStyle w:val="Compact"/>
+            </w:pPr>
+            <w:r>
+              <w:t xml:space="preserve">0.640–0.860</w:t>
+            </w:r>
+          </w:p>
+        </w:tc>
+      </w:tr>
+      <w:tr>
+        <w:tc>
+          <w:tcPr/>
+          <w:p>
+            <w:pPr>
+              <w:pStyle w:val="Compact"/>
+            </w:pPr>
+            <w:r>
+              <w:t xml:space="preserve">Pooled soft CV + Dilated% variant</w:t>
+            </w:r>
+          </w:p>
+        </w:tc>
+        <w:tc>
+          <w:tcPr/>
+          <w:p>
+            <w:pPr>
+              <w:pStyle w:val="Compact"/>
+            </w:pPr>
+            <w:r>
+              <w:t xml:space="preserve">0.75·soft(−NV-CV) + 0.25·U(−Dilated%); re-estimated on ICC pool</w:t>
+            </w:r>
+          </w:p>
+        </w:tc>
+        <w:tc>
+          <w:tcPr/>
+          <w:p>
+            <w:pPr>
+              <w:pStyle w:val="Compact"/>
+            </w:pPr>
+            <w:r>
+              <w:rPr>
+                <w:b/>
+                <w:bCs/>
+              </w:rPr>
+              <w:t xml:space="preserve">0.838</w:t>
+            </w:r>
+          </w:p>
+        </w:tc>
+        <w:tc>
+          <w:tcPr/>
+          <w:p>
+            <w:pPr>
+              <w:pStyle w:val="Compact"/>
+            </w:pPr>
+            <w:r>
+              <w:t xml:space="preserve">0.750–0.900</w:t>
+            </w:r>
+          </w:p>
+        </w:tc>
+      </w:tr>
+      <w:tr>
+        <w:tc>
+          <w:tcPr/>
+          <w:p>
+            <w:pPr>
+              <w:pStyle w:val="Compact"/>
+            </w:pPr>
+            <w:r>
+              <w:t xml:space="preserve">Default device-locked Caliber Uniformity (primary)</w:t>
+            </w:r>
+          </w:p>
+        </w:tc>
+        <w:tc>
+          <w:tcPr/>
+          <w:p>
+            <w:pPr>
+              <w:pStyle w:val="Compact"/>
+            </w:pPr>
+            <w:r>
+              <w:t xml:space="preserve">Same 0.75/0.25 weights with CIRRUS/</w:t>
+            </w:r>
+            <w:r>
+              <w:rPr>
+                <w:rStyle w:val="VerbatimChar"/>
+              </w:rPr>
+              <w:t xml:space="preserve">small_3mm</w:t>
+            </w:r>
+            <w:r>
+              <w:t xml:space="preserve"> </w:t>
+            </w:r>
+            <w:r>
+              <w:t xml:space="preserve">locked piecewise cuts</w:t>
+            </w:r>
+          </w:p>
+        </w:tc>
+        <w:tc>
+          <w:tcPr/>
+          <w:p>
+            <w:pPr>
+              <w:pStyle w:val="Compact"/>
+            </w:pPr>
+            <w:r>
+              <w:rPr>
+                <w:b/>
+                <w:bCs/>
+              </w:rPr>
+              <w:t xml:space="preserve">0.770</w:t>
+            </w:r>
+          </w:p>
+        </w:tc>
+        <w:tc>
+          <w:tcPr/>
+          <w:p>
+            <w:pPr>
+              <w:pStyle w:val="Compact"/>
+            </w:pPr>
+            <w:r>
+              <w:t xml:space="preserve">0.660–0.860</w:t>
+            </w:r>
+          </w:p>
+        </w:tc>
+      </w:tr>
+    </w:tbl>
+    <w:p>
+      <w:pPr>
+        <w:pStyle w:val="BodyText"/>
+      </w:pPr>
+      <w:r>
+        <w:rPr>
+          <w:b/>
+          <w:bCs/>
+        </w:rPr>
+        <w:t xml:space="preserve">Interpretation.</w:t>
+      </w:r>
+      <w:r>
+        <w:t xml:space="preserve"> </w:t>
+      </w:r>
+      <w:r>
+        <w:t xml:space="preserve">The legacy PCA Caliber ICC (0.434) falls in the</w:t>
+      </w:r>
+      <w:r>
+        <w:t xml:space="preserve"> </w:t>
+      </w:r>
+      <w:r>
+        <w:rPr>
+          <w:b/>
+          <w:bCs/>
+        </w:rPr>
+        <w:t xml:space="preserve">poor-to-moderate</w:t>
+      </w:r>
+      <w:r>
+        <w:t xml:space="preserve"> </w:t>
+      </w:r>
+      <w:r>
+        <w:t xml:space="preserve">range, whereas the default device-locked score (0.770) and other CV/Dilated%-based variants move into the</w:t>
+      </w:r>
+      <w:r>
+        <w:t xml:space="preserve"> </w:t>
+      </w:r>
+      <w:r>
+        <w:rPr>
+          <w:b/>
+          <w:bCs/>
+        </w:rPr>
+        <w:t xml:space="preserve">good</w:t>
+      </w:r>
+      <w:r>
+        <w:t xml:space="preserve"> </w:t>
+      </w:r>
+      <w:r>
+        <w:t xml:space="preserve">range—comparable in magnitude to Network Complexity (0.807) and approaching Area (0.859). These alternate scores are</w:t>
+      </w:r>
+      <w:r>
+        <w:t xml:space="preserve"> </w:t>
+      </w:r>
+      <w:r>
+        <w:rPr>
+          <w:b/>
+          <w:bCs/>
+        </w:rPr>
+        <w:t xml:space="preserve">not</w:t>
+      </w:r>
+      <w:r>
+        <w:t xml:space="preserve"> </w:t>
+      </w:r>
+      <w:r>
+        <w:t xml:space="preserve">monotonically aligned with the legacy PCA construct. The pooled soft variant remains a within-study sensitivity score that re-fits on the ICC pool and is therefore less transferable than the locked reference cuts used as the manuscript default. Maturity Index ICC was not improved by redefining Caliber relative to the legacy PCA-based Maturity Index (0.659) and remains moderate under the default definition (0.593). Multi-device ICC spanning all three platforms was not available for this revision (all 46 images were 3×3 mm).</w:t>
+      </w:r>
+    </w:p>
+    <w:p>
+      <w:pPr>
+        <w:pStyle w:val="BodyText"/>
+      </w:pPr>
+      <w:r>
+        <w:t xml:space="preserve">As a further sensitivity analysis on the 20 most cross-observer–concordant cases (lowest mean z-scored rater range across metrics), ICC(2,1) was 0.864 / 0.950 / 0.852 / 0.924 for area / complexity / caliber uniformity / maturity; these do not replace the primary n=46 estimates above. Detailed numeric exports are available on request / as Supplementary Material.</w:t>
+      </w:r>
+    </w:p>
+    <w:p>
+      <w:pPr>
+        <w:pStyle w:val="BodyText"/>
+      </w:pPr>
+      <w:r>
+        <w:rPr>
+          <w:b/>
+          <w:bCs/>
+        </w:rPr>
+        <w:t xml:space="preserve">Intra-observer results (YY Session 1 vs Session 2, n = 46).</w:t>
+      </w:r>
+      <w:r>
+        <w:t xml:space="preserve"> </w:t>
+      </w:r>
+      <w:r>
+        <w:t xml:space="preserve">We additionally completed same-operator test–retest: the original analyst (YY) repeated freehand ROI delineation on the same</w:t>
+      </w:r>
+      <w:r>
+        <w:t xml:space="preserve"> </w:t>
+      </w:r>
+      <w:r>
+        <w:rPr>
+          <w:b/>
+          <w:bCs/>
+        </w:rPr>
+        <w:t xml:space="preserve">n = 46</w:t>
+      </w:r>
+      <w:r>
+        <w:t xml:space="preserve"> </w:t>
+      </w:r>
+      <w:r>
+        <w:t xml:space="preserve">lesions in a separate sitting, with automated processing unchanged. Session exports initially mixed legacy PCA and current default Caliber definitions across sittings; unharmonized default Caliber/Maturity columns are therefore</w:t>
+      </w:r>
+      <w:r>
+        <w:t xml:space="preserve"> </w:t>
+      </w:r>
+      <w:r>
+        <w:rPr>
+          <w:b/>
+          <w:bCs/>
+        </w:rPr>
+        <w:t xml:space="preserve">not</w:t>
+      </w:r>
+      <w:r>
+        <w:t xml:space="preserve"> </w:t>
+      </w:r>
+      <w:r>
+        <w:t xml:space="preserve">comparable and are</w:t>
+      </w:r>
+      <w:r>
+        <w:t xml:space="preserve"> </w:t>
+      </w:r>
+      <w:r>
+        <w:rPr>
+          <w:b/>
+          <w:bCs/>
+        </w:rPr>
+        <w:t xml:space="preserve">not</w:t>
+      </w:r>
+      <w:r>
+        <w:t xml:space="preserve"> </w:t>
+      </w:r>
+      <w:r>
+        <w:t xml:space="preserve">reported. For Caliber Uniformity and Maturity Index in this intra comparison, we report the</w:t>
+      </w:r>
+      <w:r>
+        <w:t xml:space="preserve"> </w:t>
+      </w:r>
+      <w:r>
+        <w:rPr>
+          <w:b/>
+          <w:bCs/>
+        </w:rPr>
+        <w:t xml:space="preserve">same device-locked default Standardized Caliber Uniformity Score applied to both sessions</w:t>
+      </w:r>
+      <w:r>
+        <w:t xml:space="preserve">—the primary inter-observer Caliber endpoint—alongside Area and Network Complexity (unchanged definitions).</w:t>
+      </w:r>
+    </w:p>
+    <w:tbl>
+      <w:tblPr>
+        <w:tblStyle w:val="Table"/>
+        <w:tblW w:type="pct" w:w="5000"/>
+        <w:tblLayout w:type="fixed"/>
+        <w:tblLook w:firstRow="1" w:lastRow="0" w:firstColumn="0" w:lastColumn="0" w:noHBand="0" w:noVBand="0" w:val="0020"/>
+      </w:tblPr>
+      <w:tblGrid>
+        <w:gridCol w:w="2436"/>
+        <w:gridCol w:w="3046"/>
+        <w:gridCol w:w="2436"/>
+      </w:tblGrid>
+      <w:tr>
+        <w:trPr>
+          <w:tblHeader w:val="on"/>
+        </w:trPr>
+        <w:tc>
+          <w:tcPr/>
+          <w:p>
+            <w:pPr>
+              <w:pStyle w:val="Compact"/>
+            </w:pPr>
+            <w:r>
+              <w:t xml:space="preserve">Metric</w:t>
+            </w:r>
+          </w:p>
+        </w:tc>
+        <w:tc>
+          <w:tcPr/>
+          <w:p>
+            <w:pPr>
+              <w:pStyle w:val="Compact"/>
+            </w:pPr>
+            <w:r>
+              <w:t xml:space="preserve">ICC(2,1)</w:t>
+            </w:r>
+          </w:p>
+        </w:tc>
+        <w:tc>
+          <w:tcPr/>
+          <w:p>
+            <w:pPr>
+              <w:pStyle w:val="Compact"/>
+            </w:pPr>
+            <w:r>
+              <w:t xml:space="preserve">95% CI</w:t>
+            </w:r>
+          </w:p>
+        </w:tc>
+      </w:tr>
+      <w:tr>
+        <w:tc>
+          <w:tcPr/>
+          <w:p>
+            <w:pPr>
+              <w:pStyle w:val="Compact"/>
+            </w:pPr>
+            <w:r>
+              <w:t xml:space="preserve">MNV Area (mm²)</w:t>
+            </w:r>
+          </w:p>
+        </w:tc>
+        <w:tc>
+          <w:tcPr/>
+          <w:p>
+            <w:pPr>
+              <w:pStyle w:val="Compact"/>
+            </w:pPr>
+            <w:r>
+              <w:t xml:space="preserve">0.979</w:t>
+            </w:r>
+          </w:p>
+        </w:tc>
+        <w:tc>
+          <w:tcPr/>
+          <w:p>
+            <w:pPr>
+              <w:pStyle w:val="Compact"/>
+            </w:pPr>
+            <w:r>
+              <w:t xml:space="preserve">0.962–0.988</w:t>
+            </w:r>
+          </w:p>
+        </w:tc>
+      </w:tr>
+      <w:tr>
+        <w:tc>
+          <w:tcPr/>
+          <w:p>
+            <w:pPr>
+              <w:pStyle w:val="Compact"/>
+            </w:pPr>
+            <w:r>
+              <w:t xml:space="preserve">Network Complexity Score</w:t>
+            </w:r>
+          </w:p>
+        </w:tc>
+        <w:tc>
+          <w:tcPr/>
+          <w:p>
+            <w:pPr>
+              <w:pStyle w:val="Compact"/>
+            </w:pPr>
+            <w:r>
+              <w:t xml:space="preserve">0.950</w:t>
+            </w:r>
+          </w:p>
+        </w:tc>
+        <w:tc>
+          <w:tcPr/>
+          <w:p>
+            <w:pPr>
+              <w:pStyle w:val="Compact"/>
+            </w:pPr>
+            <w:r>
+              <w:t xml:space="preserve">0.913–0.973</w:t>
+            </w:r>
+          </w:p>
+        </w:tc>
+      </w:tr>
+      <w:tr>
+        <w:tc>
+          <w:tcPr/>
+          <w:p>
+            <w:pPr>
+              <w:pStyle w:val="Compact"/>
+            </w:pPr>
+            <w:r>
+              <w:t xml:space="preserve">Caliber Uniformity Score (default, device-locked)</w:t>
+            </w:r>
+          </w:p>
+        </w:tc>
+        <w:tc>
+          <w:tcPr/>
+          <w:p>
+            <w:pPr>
+              <w:pStyle w:val="Compact"/>
+            </w:pPr>
+            <w:r>
+              <w:t xml:space="preserve">0.925</w:t>
+            </w:r>
+          </w:p>
+        </w:tc>
+        <w:tc>
+          <w:tcPr/>
+          <w:p>
+            <w:pPr>
+              <w:pStyle w:val="Compact"/>
+            </w:pPr>
+            <w:r>
+              <w:t xml:space="preserve">0.871–0.959</w:t>
+            </w:r>
+          </w:p>
+        </w:tc>
+      </w:tr>
+      <w:tr>
+        <w:tc>
+          <w:tcPr/>
+          <w:p>
+            <w:pPr>
+              <w:pStyle w:val="Compact"/>
+            </w:pPr>
+            <w:r>
+              <w:t xml:space="preserve">Maturity Index (from default Caliber)</w:t>
+            </w:r>
+          </w:p>
+        </w:tc>
+        <w:tc>
+          <w:tcPr/>
+          <w:p>
+            <w:pPr>
+              <w:pStyle w:val="Compact"/>
+            </w:pPr>
+            <w:r>
+              <w:t xml:space="preserve">0.917</w:t>
+            </w:r>
+          </w:p>
+        </w:tc>
+        <w:tc>
+          <w:tcPr/>
+          <w:p>
+            <w:pPr>
+              <w:pStyle w:val="Compact"/>
+            </w:pPr>
+            <w:r>
+              <w:t xml:space="preserve">0.857–0.954</w:t>
+            </w:r>
+          </w:p>
+        </w:tc>
+      </w:tr>
+    </w:tbl>
+    <w:p>
+      <w:pPr>
+        <w:pStyle w:val="BodyText"/>
+      </w:pPr>
+      <w:r>
+        <w:t xml:space="preserve">Within-rater agreement was excellent for Area, Network Complexity, and the default Caliber Uniformity and Maturity Index (all ICC(2,1) &gt; 0.90). These intra-observer estimates support within-operator reproducibility under a fixed score definition; they supplement, and do</w:t>
+      </w:r>
+      <w:r>
+        <w:t xml:space="preserve"> </w:t>
+      </w:r>
+      <w:r>
+        <w:rPr>
+          <w:b/>
+          <w:bCs/>
+        </w:rPr>
+        <w:t xml:space="preserve">not</w:t>
+      </w:r>
+      <w:r>
+        <w:t xml:space="preserve"> </w:t>
+      </w:r>
+      <w:r>
+        <w:t xml:space="preserve">replace, the three-observer inter-observer ICCs as the primary multi-rater reproducibility claim.</w:t>
       </w:r>
     </w:p>
     <w:bookmarkEnd w:id="17"/>
@@ -1691,7 +2736,7 @@
         <w:br/>
       </w:r>
       <w:r>
-        <w:t xml:space="preserve">We agree. Absence of a statistically significant Kruskal–Wallis test does not demonstrate equivalence—and, on re-analysis of the primary git batch CSVs (commit</w:t>
+        <w:t xml:space="preserve">We agree. Absence of a statistically significant Kruskal–Wallis test does not demonstrate equivalence. We now report Kruskal–Wallis H, p, and ε² with bootstrap 95% CIs (10 000 within-stratum resamples; seed</w:t>
       </w:r>
       <w:r>
         <w:t xml:space="preserve"> </w:t>
@@ -1700,30 +2745,26 @@
         <w:rPr>
           <w:rStyle w:val="VerbatimChar"/>
         </w:rPr>
-        <w:t xml:space="preserve">1e5d202</w:t>
-      </w:r>
-      <w:r>
-        <w:t xml:space="preserve">; n = 112: large = 49, small = 33, small_3mm = 30), not all between-stratum Kruskal–Wallis tests were non-significant.</w:t>
-      </w:r>
-    </w:p>
-    <w:p>
-      <w:pPr>
-        <w:pStyle w:val="BodyText"/>
-      </w:pPr>
-      <w:r>
-        <w:t xml:space="preserve">We now report Kruskal–Wallis H, p, and ε² with bootstrap 95% CIs (10 000 within-stratum resamples; seed</w:t>
-      </w:r>
-      <w:r>
-        <w:t xml:space="preserve"> </w:t>
-      </w:r>
-      <w:r>
-        <w:rPr>
-          <w:rStyle w:val="VerbatimChar"/>
-        </w:rPr>
         <w:t xml:space="preserve">20260727</w:t>
       </w:r>
       <w:r>
-        <w:t xml:space="preserve">):</w:t>
+        <w:t xml:space="preserve">) for the</w:t>
+      </w:r>
+      <w:r>
+        <w:t xml:space="preserve"> </w:t>
+      </w:r>
+      <w:r>
+        <w:rPr>
+          <w:b/>
+          <w:bCs/>
+        </w:rPr>
+        <w:t xml:space="preserve">default</w:t>
+      </w:r>
+      <w:r>
+        <w:t xml:space="preserve"> </w:t>
+      </w:r>
+      <w:r>
+        <w:t xml:space="preserve">Standardized Caliber Uniformity Score used as the primary Caliber endpoint in the revised manuscript (device-/stratum-locked NV Diameter CV + Dilated vessel %; Maturity Index recomputed from that Caliber score; Network Complexity unchanged), on the primary batch CSVs (n = 112: large = 49, small = 33, small_3mm = 30):</w:t>
       </w:r>
     </w:p>
     <w:tbl>
@@ -1888,62 +2929,62 @@
               <w:pStyle w:val="Compact"/>
             </w:pPr>
             <w:r>
-              <w:t xml:space="preserve">Caliber Uniformity Score</w:t>
-            </w:r>
-          </w:p>
-        </w:tc>
-        <w:tc>
-          <w:tcPr/>
-          <w:p>
-            <w:pPr>
-              <w:pStyle w:val="Compact"/>
-            </w:pPr>
-            <w:r>
-              <w:t xml:space="preserve">27.713</w:t>
-            </w:r>
-          </w:p>
-        </w:tc>
-        <w:tc>
-          <w:tcPr/>
-          <w:p>
-            <w:pPr>
-              <w:pStyle w:val="Compact"/>
-            </w:pPr>
-            <w:r>
-              <w:t xml:space="preserve">9.6×10⁻⁷</w:t>
-            </w:r>
-          </w:p>
-        </w:tc>
-        <w:tc>
-          <w:tcPr/>
-          <w:p>
-            <w:pPr>
-              <w:pStyle w:val="Compact"/>
-            </w:pPr>
-            <w:r>
-              <w:t xml:space="preserve">0.2359</w:t>
-            </w:r>
-          </w:p>
-        </w:tc>
-        <w:tc>
-          <w:tcPr/>
-          <w:p>
-            <w:pPr>
-              <w:pStyle w:val="Compact"/>
-            </w:pPr>
-            <w:r>
-              <w:t xml:space="preserve">0.1121–0.3959</w:t>
-            </w:r>
-          </w:p>
-        </w:tc>
-        <w:tc>
-          <w:tcPr/>
-          <w:p>
-            <w:pPr>
-              <w:pStyle w:val="Compact"/>
-            </w:pPr>
-            <w:r>
-              <w:t xml:space="preserve">66.4 / 56.7 / 58.9</w:t>
+              <w:t xml:space="preserve">Caliber Uniformity Score (default)</w:t>
+            </w:r>
+          </w:p>
+        </w:tc>
+        <w:tc>
+          <w:tcPr/>
+          <w:p>
+            <w:pPr>
+              <w:pStyle w:val="Compact"/>
+            </w:pPr>
+            <w:r>
+              <w:t xml:space="preserve">1.118</w:t>
+            </w:r>
+          </w:p>
+        </w:tc>
+        <w:tc>
+          <w:tcPr/>
+          <w:p>
+            <w:pPr>
+              <w:pStyle w:val="Compact"/>
+            </w:pPr>
+            <w:r>
+              <w:t xml:space="preserve">0.572</w:t>
+            </w:r>
+          </w:p>
+        </w:tc>
+        <w:tc>
+          <w:tcPr/>
+          <w:p>
+            <w:pPr>
+              <w:pStyle w:val="Compact"/>
+            </w:pPr>
+            <w:r>
+              <w:t xml:space="preserve">0.0000</w:t>
+            </w:r>
+          </w:p>
+        </w:tc>
+        <w:tc>
+          <w:tcPr/>
+          <w:p>
+            <w:pPr>
+              <w:pStyle w:val="Compact"/>
+            </w:pPr>
+            <w:r>
+              <w:t xml:space="preserve">0.0000–0.082</w:t>
+            </w:r>
+          </w:p>
+        </w:tc>
+        <w:tc>
+          <w:tcPr/>
+          <w:p>
+            <w:pPr>
+              <w:pStyle w:val="Compact"/>
+            </w:pPr>
+            <w:r>
+              <w:t xml:space="preserve">46.6 / 55.5 / 50.6</w:t>
             </w:r>
           </w:p>
         </w:tc>
@@ -1956,62 +2997,62 @@
               <w:pStyle w:val="Compact"/>
             </w:pPr>
             <w:r>
-              <w:t xml:space="preserve">Maturity Index</w:t>
-            </w:r>
-          </w:p>
-        </w:tc>
-        <w:tc>
-          <w:tcPr/>
-          <w:p>
-            <w:pPr>
-              <w:pStyle w:val="Compact"/>
-            </w:pPr>
-            <w:r>
-              <w:t xml:space="preserve">28.690</w:t>
-            </w:r>
-          </w:p>
-        </w:tc>
-        <w:tc>
-          <w:tcPr/>
-          <w:p>
-            <w:pPr>
-              <w:pStyle w:val="Compact"/>
-            </w:pPr>
-            <w:r>
-              <w:t xml:space="preserve">5.89×10⁻⁷</w:t>
-            </w:r>
-          </w:p>
-        </w:tc>
-        <w:tc>
-          <w:tcPr/>
-          <w:p>
-            <w:pPr>
-              <w:pStyle w:val="Compact"/>
-            </w:pPr>
-            <w:r>
-              <w:t xml:space="preserve">0.2449</w:t>
-            </w:r>
-          </w:p>
-        </w:tc>
-        <w:tc>
-          <w:tcPr/>
-          <w:p>
-            <w:pPr>
-              <w:pStyle w:val="Compact"/>
-            </w:pPr>
-            <w:r>
-              <w:t xml:space="preserve">0.1224–0.4078</w:t>
-            </w:r>
-          </w:p>
-        </w:tc>
-        <w:tc>
-          <w:tcPr/>
-          <w:p>
-            <w:pPr>
-              <w:pStyle w:val="Compact"/>
-            </w:pPr>
-            <w:r>
-              <w:t xml:space="preserve">57.5 / 52.4 / 52.8</w:t>
+              <w:t xml:space="preserve">Maturity Index (from default Caliber)</w:t>
+            </w:r>
+          </w:p>
+        </w:tc>
+        <w:tc>
+          <w:tcPr/>
+          <w:p>
+            <w:pPr>
+              <w:pStyle w:val="Compact"/>
+            </w:pPr>
+            <w:r>
+              <w:t xml:space="preserve">1.082</w:t>
+            </w:r>
+          </w:p>
+        </w:tc>
+        <w:tc>
+          <w:tcPr/>
+          <w:p>
+            <w:pPr>
+              <w:pStyle w:val="Compact"/>
+            </w:pPr>
+            <w:r>
+              <w:t xml:space="preserve">0.582</w:t>
+            </w:r>
+          </w:p>
+        </w:tc>
+        <w:tc>
+          <w:tcPr/>
+          <w:p>
+            <w:pPr>
+              <w:pStyle w:val="Compact"/>
+            </w:pPr>
+            <w:r>
+              <w:t xml:space="preserve">0.0000</w:t>
+            </w:r>
+          </w:p>
+        </w:tc>
+        <w:tc>
+          <w:tcPr/>
+          <w:p>
+            <w:pPr>
+              <w:pStyle w:val="Compact"/>
+            </w:pPr>
+            <w:r>
+              <w:t xml:space="preserve">0.0000–0.077</w:t>
+            </w:r>
+          </w:p>
+        </w:tc>
+        <w:tc>
+          <w:tcPr/>
+          <w:p>
+            <w:pPr>
+              <w:pStyle w:val="Compact"/>
+            </w:pPr>
+            <w:r>
+              <w:t xml:space="preserve">49.5 / 53.9 / 51.0</w:t>
             </w:r>
           </w:p>
         </w:tc>
@@ -2026,13 +3067,13 @@
           <w:b/>
           <w:bCs/>
         </w:rPr>
-        <w:t xml:space="preserve">Interpretation:</w:t>
-      </w:r>
-      <w:r>
-        <w:t xml:space="preserve"> </w:t>
-      </w:r>
-      <w:r>
-        <w:t xml:space="preserve">Network Complexity does not differ across strata (p ≈ 0.43; ε² ≈ 0, negligible). In contrast, Caliber Uniformity and Maturity Index show significant between-stratum differences (both p &lt; 0.001) with medium-to-large ε² (≈ 0.24). Thus the original “all Kruskal–Wallis non-significant → scores comparable across devices” framing was incorrect and has been withdrawn. Median-anchored normalization places each stratum’s median near 50 by design, but does</w:t>
+        <w:t xml:space="preserve">Interpretation (primary / default Caliber):</w:t>
+      </w:r>
+      <w:r>
+        <w:t xml:space="preserve"> </w:t>
+      </w:r>
+      <w:r>
+        <w:t xml:space="preserve">Under the default Standardized Caliber Uniformity Score, none of the three standardized scores differed significantly across strata (all p ≥ 0.425; ε² ≈ 0, negligible). This does</w:t>
       </w:r>
       <w:r>
         <w:t xml:space="preserve"> </w:t>
@@ -2048,7 +3089,7 @@
         <w:t xml:space="preserve"> </w:t>
       </w:r>
       <w:r>
-        <w:t xml:space="preserve">eliminate between-stratum differences or establish biological equivalence—consistent with, and strengthening, Comments 1 and 5.</w:t>
+        <w:t xml:space="preserve">establish biological equivalence across devices: median-anchored piecewise mapping and locked reference cuts can attenuate stratum-mean contrasts by construction. The original “all Kruskal–Wallis non-significant → scores comparable across devices” framing remains withdrawn.</w:t>
       </w:r>
     </w:p>
     <w:p>
@@ -2060,25 +3101,91 @@
           <w:b/>
           <w:bCs/>
         </w:rPr>
+        <w:t xml:space="preserve">Legacy sensitivity (PCA-based Caliber Uniformity on the same cases):</w:t>
+      </w:r>
+      <w:r>
+        <w:t xml:space="preserve"> </w:t>
+      </w:r>
+      <w:r>
+        <w:t xml:space="preserve">the prior PCA Stability Caliber composite showed significant between-stratum Caliber/Maturity differences (Caliber H = 27.713, p = 9.6×10⁻⁷, ε² = 0.2359 [0.1121–0.3959], medians 66.4 / 56.7 / 58.9; Maturity H = 28.690, p = 5.89×10⁻⁷, ε² = 0.2449 [0.1224–0.4078], medians 57.5 / 52.4 / 52.8), while Complexity remained NS. That legacy pattern is disclosed as sensitivity context and is</w:t>
+      </w:r>
+      <w:r>
+        <w:t xml:space="preserve"> </w:t>
+      </w:r>
+      <w:r>
+        <w:rPr>
+          <w:b/>
+          <w:bCs/>
+        </w:rPr>
+        <w:t xml:space="preserve">not</w:t>
+      </w:r>
+      <w:r>
+        <w:t xml:space="preserve"> </w:t>
+      </w:r>
+      <w:r>
+        <w:t xml:space="preserve">the primary endpoint narrative in this revision.</w:t>
+      </w:r>
+    </w:p>
+    <w:p>
+      <w:pPr>
+        <w:pStyle w:val="BodyText"/>
+      </w:pPr>
+      <w:r>
+        <w:rPr>
+          <w:b/>
+          <w:bCs/>
+        </w:rPr>
         <w:t xml:space="preserve">Changes made:</w:t>
       </w:r>
       <w:r>
         <w:t xml:space="preserve"> </w:t>
       </w:r>
       <w:r>
-        <w:t xml:space="preserve">- Removed “statistically indistinguishable / therefore comparable” and “all KW non-significant” language.</w:t>
-      </w:r>
-      <w:r>
-        <w:t xml:space="preserve"> </w:t>
-      </w:r>
-      <w:r>
-        <w:t xml:space="preserve">- Added ε² with bootstrap CIs alongside Kruskal–Wallis statistics (revised Table 3 / Results).</w:t>
-      </w:r>
-      <w:r>
-        <w:t xml:space="preserve"> </w:t>
-      </w:r>
-      <w:r>
-        <w:t xml:space="preserve">- Explicitly report that Complexity is NS whereas Caliber Uniformity and Maturity Index differ across strata with non-negligible effect sizes.</w:t>
+        <w:t xml:space="preserve">- Removed “statistically indistinguishable / therefore comparable” and “all KW non-significant therefore equivalent” language.</w:t>
+      </w:r>
+      <w:r>
+        <w:t xml:space="preserve"> </w:t>
+      </w:r>
+      <w:r>
+        <w:t xml:space="preserve">-</w:t>
+      </w:r>
+      <w:r>
+        <w:t xml:space="preserve"> </w:t>
+      </w:r>
+      <w:r>
+        <w:rPr>
+          <w:b/>
+          <w:bCs/>
+        </w:rPr>
+        <w:t xml:space="preserve">Table 3</w:t>
+      </w:r>
+      <w:r>
+        <w:t xml:space="preserve"> </w:t>
+      </w:r>
+      <w:r>
+        <w:t xml:space="preserve">now reports H, p, ε², and bootstrap 95% CIs under the</w:t>
+      </w:r>
+      <w:r>
+        <w:t xml:space="preserve"> </w:t>
+      </w:r>
+      <w:r>
+        <w:rPr>
+          <w:b/>
+          <w:bCs/>
+        </w:rPr>
+        <w:t xml:space="preserve">default</w:t>
+      </w:r>
+      <w:r>
+        <w:t xml:space="preserve"> </w:t>
+      </w:r>
+      <w:r>
+        <w:t xml:space="preserve">Caliber Uniformity definition (columns: Median [large/small/small_3mm], H, p, ε², 95% CI); Table note discloses that original PCA-Caliber Table 3 values are legacy sensitivity only.</w:t>
+      </w:r>
+      <w:r>
+        <w:t xml:space="preserve"> </w:t>
+      </w:r>
+      <w:r>
+        <w:t xml:space="preserve">- Explicitly state that non-significant KW under the default score still does not establish equivalence; disclose the legacy PCA between-stratum differences as sensitivity only.</w:t>
       </w:r>
       <w:r>
         <w:t xml:space="preserve"> </w:t>
@@ -2306,7 +3413,49 @@
         <w:pStyle w:val="BodyText"/>
       </w:pPr>
       <w:r>
-        <w:t xml:space="preserve">The Abstract, Introduction, Discussion, tables, and figure legends now use these names consistently. Where “stability” appears conceptually, it is explicitly linked to caliber uniformity.</w:t>
+        <w:t xml:space="preserve">The Abstract, Introduction, Discussion,</w:t>
+      </w:r>
+      <w:r>
+        <w:t xml:space="preserve"> </w:t>
+      </w:r>
+      <w:r>
+        <w:rPr>
+          <w:b/>
+          <w:bCs/>
+        </w:rPr>
+        <w:t xml:space="preserve">Tables 1–5</w:t>
+      </w:r>
+      <w:r>
+        <w:t xml:space="preserve">, and figure legends now use these names consistently. Where “stability” appears conceptually, it is explicitly linked to caliber uniformity.</w:t>
+      </w:r>
+      <w:r>
+        <w:t xml:space="preserve"> </w:t>
+      </w:r>
+      <w:r>
+        <w:rPr>
+          <w:b/>
+          <w:bCs/>
+        </w:rPr>
+        <w:t xml:space="preserve">Table 1</w:t>
+      </w:r>
+      <w:r>
+        <w:t xml:space="preserve"> </w:t>
+      </w:r>
+      <w:r>
+        <w:t xml:space="preserve">Category “Stability” was renamed</w:t>
+      </w:r>
+      <w:r>
+        <w:t xml:space="preserve"> </w:t>
+      </w:r>
+      <w:r>
+        <w:rPr>
+          <w:b/>
+          <w:bCs/>
+        </w:rPr>
+        <w:t xml:space="preserve">Caliber Uniformity</w:t>
+      </w:r>
+      <w:r>
+        <w:t xml:space="preserve">; score descriptions distinguish default vs legacy Caliber definitions.</w:t>
       </w:r>
     </w:p>
     <w:p>
@@ -2340,7 +3489,36 @@
         <w:t xml:space="preserve"> </w:t>
       </w:r>
       <w:r>
-        <w:t xml:space="preserve">part of the operational five-subtype scheme used in this study (Dead tree, Tree-in-bud, Glomerular, Seafan, Medusa). They have been removed from Table 5 / the comparative biomarker table (or clearly labeled as literature-only descriptors if retained for historical comparison). Table 4 and the classification Methods are now fully aligned.</w:t>
+        <w:t xml:space="preserve">part of the operational five-subtype scheme used in this study (Dead tree, Tree in bud, Glomerular, Seafan, Medusa). They have been</w:t>
+      </w:r>
+      <w:r>
+        <w:t xml:space="preserve"> </w:t>
+      </w:r>
+      <w:r>
+        <w:rPr>
+          <w:b/>
+          <w:bCs/>
+        </w:rPr>
+        <w:t xml:space="preserve">removed from Table 5</w:t>
+      </w:r>
+      <w:r>
+        <w:t xml:space="preserve">. Table 5 now maps only the five operational subtypes to morphology-derived interpretive categories.</w:t>
+      </w:r>
+      <w:r>
+        <w:t xml:space="preserve"> </w:t>
+      </w:r>
+      <w:r>
+        <w:rPr>
+          <w:b/>
+          <w:bCs/>
+        </w:rPr>
+        <w:t xml:space="preserve">Table 4</w:t>
+      </w:r>
+      <w:r>
+        <w:t xml:space="preserve"> </w:t>
+      </w:r>
+      <w:r>
+        <w:t xml:space="preserve">and the classification Methods are fully aligned with that five-class scheme.</w:t>
       </w:r>
     </w:p>
     <w:p>
@@ -2392,7 +3570,36 @@
         <w:t xml:space="preserve"> </w:t>
       </w:r>
       <w:r>
-        <w:t xml:space="preserve">(Optovue/Visionix). The erroneous “Heidelberg Solix” wording in the Table 2 legend has been corrected.</w:t>
+        <w:t xml:space="preserve">(Optovue/Visionix). The erroneous “Heidelberg Solix” wording in the original</w:t>
+      </w:r>
+      <w:r>
+        <w:t xml:space="preserve"> </w:t>
+      </w:r>
+      <w:r>
+        <w:rPr>
+          <w:b/>
+          <w:bCs/>
+        </w:rPr>
+        <w:t xml:space="preserve">Table 2</w:t>
+      </w:r>
+      <w:r>
+        <w:t xml:space="preserve"> </w:t>
+      </w:r>
+      <w:r>
+        <w:t xml:space="preserve">legend has been corrected; restored Table 2 column headers and note now read</w:t>
+      </w:r>
+      <w:r>
+        <w:t xml:space="preserve"> </w:t>
+      </w:r>
+      <w:r>
+        <w:rPr>
+          <w:b/>
+          <w:bCs/>
+        </w:rPr>
+        <w:t xml:space="preserve">Optovue Solix</w:t>
+      </w:r>
+      <w:r>
+        <w:t xml:space="preserve">.</w:t>
       </w:r>
     </w:p>
     <w:p>
@@ -2542,16 +3749,20 @@
               <w:pStyle w:val="Compact"/>
             </w:pPr>
             <w:r>
-              <w:t xml:space="preserve">Done — ICC(2,1): area 0.859 (0.680–0.930); complexity 0.807 (0.660–0.890); caliber 0.434 (0.260–0.610); maturity 0.659 (0.510–0.780);</w:t>
+              <w:t xml:space="preserve">Done — ICC(2,1): area 0.859 (0.680–0.930); complexity 0.807 (0.660–0.890);</w:t>
             </w:r>
             <w:r>
               <w:t xml:space="preserve"> </w:t>
             </w:r>
             <w:r>
               <w:rPr>
-                <w:rStyle w:val="VerbatimChar"/>
+                <w:b/>
+                <w:bCs/>
               </w:rPr>
-              <w:t xml:space="preserve">icc/icc_multirater_results.md</w:t>
+              <w:t xml:space="preserve">Caliber Uniformity (default) 0.770 (0.660–0.860)</w:t>
+            </w:r>
+            <w:r>
+              <w:t xml:space="preserve">; Maturity 0.593 (0.430–0.730); legacy PCA Caliber 0.434 as sensitivity</w:t>
             </w:r>
           </w:p>
         </w:tc>
@@ -2575,7 +3786,23 @@
               <w:pStyle w:val="Compact"/>
             </w:pPr>
             <w:r>
-              <w:t xml:space="preserve">Added — Complexity NS (ε²≈0); Caliber Uniformity &amp; Maturity Index significant (ε²≈0.24); not “all KW NS”</w:t>
+              <w:t xml:space="preserve">Added — under</w:t>
+            </w:r>
+            <w:r>
+              <w:t xml:space="preserve"> </w:t>
+            </w:r>
+            <w:r>
+              <w:rPr>
+                <w:b/>
+                <w:bCs/>
+              </w:rPr>
+              <w:t xml:space="preserve">default</w:t>
+            </w:r>
+            <w:r>
+              <w:t xml:space="preserve"> </w:t>
+            </w:r>
+            <w:r>
+              <w:t xml:space="preserve">Caliber: all three scores NS (ε²≈0); legacy PCA Caliber/Maturity had ε²≈0.24 (sensitivity only); not “all KW NS → equivalent”</w:t>
             </w:r>
           </w:p>
         </w:tc>
@@ -2636,18 +3863,31 @@
               <w:pStyle w:val="Compact"/>
             </w:pPr>
             <w:r>
-              <w:t xml:space="preserve">Intra-observer test–retest (optional); longitudinal clinical anchors; full baseline demographics</w:t>
-            </w:r>
-          </w:p>
-        </w:tc>
-        <w:tc>
-          <w:tcPr/>
-          <w:p>
-            <w:pPr>
-              <w:pStyle w:val="Compact"/>
-            </w:pPr>
-            <w:r>
-              <w:t xml:space="preserve">Intra-observer optional/limitation if unavailable; clinical anchors / full demographics not feasible in this anonymized dataset — listed as Limitations</w:t>
+              <w:t xml:space="preserve">Intra-observer test–retest (YY Session1 vs Session2, n=46); longitudinal clinical anchors; full baseline demographics</w:t>
+            </w:r>
+          </w:p>
+        </w:tc>
+        <w:tc>
+          <w:tcPr/>
+          <w:p>
+            <w:pPr>
+              <w:pStyle w:val="Compact"/>
+            </w:pPr>
+            <w:r>
+              <w:t xml:space="preserve">Intra done — ICC(2,1): area 0.979 (0.962–0.988); complexity 0.950 (0.913–0.973); Caliber 0.925 (0.871–0.959); Maturity 0.917 (0.857–0.954) under</w:t>
+            </w:r>
+            <w:r>
+              <w:t xml:space="preserve"> </w:t>
+            </w:r>
+            <w:r>
+              <w:rPr>
+                <w:b/>
+                <w:bCs/>
+              </w:rPr>
+              <w:t xml:space="preserve">same device-locked definition applied to both sessions</w:t>
+            </w:r>
+            <w:r>
+              <w:t xml:space="preserve">. Clinical anchors / full demographics not feasible in this anonymized dataset — listed as Limitations</w:t>
             </w:r>
           </w:p>
         </w:tc>
@@ -2682,187 +3922,8 @@
         <w:t xml:space="preserve">Yasuo Yanagi, on behalf of all co-authors</w:t>
       </w:r>
     </w:p>
-    <w:p>
-      <w:r>
-        <w:pict>
-          <v:rect style="width:0;height:1.5pt" o:hralign="center" o:hrstd="t" o:hr="t"/>
-        </w:pict>
-      </w:r>
-    </w:p>
     <w:bookmarkEnd w:id="22"/>
-    <w:bookmarkStart w:id="23" w:name="internal-notes-not-for-submission"/>
-    <w:p>
-      <w:pPr>
-        <w:pStyle w:val="Heading2"/>
-      </w:pPr>
-      <w:r>
-        <w:t xml:space="preserve">Internal notes (NOT for submission)</w:t>
-      </w:r>
-    </w:p>
-    <w:p>
-      <w:pPr>
-        <w:pStyle w:val="Compact"/>
-        <w:numPr>
-          <w:ilvl w:val="0"/>
-          <w:numId w:val="1003"/>
-        </w:numPr>
-      </w:pPr>
-      <w:r>
-        <w:t xml:space="preserve">Fill ICC placeholders after analyses (κ filled from</w:t>
-      </w:r>
-      <w:r>
-        <w:t xml:space="preserve"> </w:t>
-      </w:r>
-      <w:r>
-        <w:rPr>
-          <w:rStyle w:val="VerbatimChar"/>
-        </w:rPr>
-        <w:t xml:space="preserve">grading/agreement_stats.md</w:t>
-      </w:r>
-      <w:r>
-        <w:t xml:space="preserve">; effect sizes filled from</w:t>
-      </w:r>
-      <w:r>
-        <w:t xml:space="preserve"> </w:t>
-      </w:r>
-      <w:r>
-        <w:rPr>
-          <w:rStyle w:val="VerbatimChar"/>
-        </w:rPr>
-        <w:t xml:space="preserve">stats/table3_effect_sizes.md</w:t>
-      </w:r>
-      <w:r>
-        <w:t xml:space="preserve">;</w:t>
-      </w:r>
-      <w:r>
-        <w:t xml:space="preserve"> </w:t>
-      </w:r>
-      <w:r>
-        <w:rPr>
-          <w:b/>
-          <w:bCs/>
-        </w:rPr>
-        <w:t xml:space="preserve">ICC filled from</w:t>
-      </w:r>
-      <w:r>
-        <w:rPr>
-          <w:b/>
-          <w:bCs/>
-        </w:rPr>
-        <w:t xml:space="preserve"> </w:t>
-      </w:r>
-      <w:r>
-        <w:rPr>
-          <w:rStyle w:val="VerbatimChar"/>
-          <w:b/>
-          <w:bCs/>
-        </w:rPr>
-        <w:t xml:space="preserve">icc/icc_multirater_results.md</w:t>
-      </w:r>
-      <w:r>
-        <w:t xml:space="preserve">).</w:t>
-      </w:r>
-    </w:p>
-    <w:p>
-      <w:pPr>
-        <w:pStyle w:val="Compact"/>
-        <w:numPr>
-          <w:ilvl w:val="0"/>
-          <w:numId w:val="1003"/>
-        </w:numPr>
-      </w:pPr>
-      <w:r>
-        <w:t xml:space="preserve">Decide final title (suggest removing “Pathophysiological” or replacing with “Morphology-Derived Categorization”).</w:t>
-      </w:r>
-    </w:p>
-    <w:p>
-      <w:pPr>
-        <w:pStyle w:val="Compact"/>
-        <w:numPr>
-          <w:ilvl w:val="0"/>
-          <w:numId w:val="1003"/>
-        </w:numPr>
-      </w:pPr>
-      <w:r>
-        <w:t xml:space="preserve">Suggested title option:</w:t>
-      </w:r>
-      <w:r>
-        <w:br/>
-      </w:r>
-      <w:r>
-        <w:rPr>
-          <w:i/>
-          <w:iCs/>
-        </w:rPr>
-        <w:t xml:space="preserve">Novel Semi-Automated System for Multi-Dimensional Analysis of Macular Neovascularization: Quantitative Biomarkers and Rule-Based Morphological Categorization Across OCTA Platforms</w:t>
-      </w:r>
-    </w:p>
-    <w:p>
-      <w:pPr>
-        <w:pStyle w:val="Compact"/>
-        <w:numPr>
-          <w:ilvl w:val="0"/>
-          <w:numId w:val="1003"/>
-        </w:numPr>
-      </w:pPr>
-      <w:r>
-        <w:t xml:space="preserve">Figure 1 = existing multi-device examples; Figure 2 = new workflow schematic (to create).</w:t>
-      </w:r>
-    </w:p>
-    <w:p>
-      <w:pPr>
-        <w:pStyle w:val="Compact"/>
-        <w:numPr>
-          <w:ilvl w:val="0"/>
-          <w:numId w:val="1003"/>
-        </w:numPr>
-      </w:pPr>
-      <w:r>
-        <w:t xml:space="preserve">For expert grading: YY should grade from original OCTA (or unmarked exports) without seeing automated subtype; lock grades before unblinding.</w:t>
-      </w:r>
-    </w:p>
-    <w:p>
-      <w:pPr>
-        <w:pStyle w:val="Compact"/>
-        <w:numPr>
-          <w:ilvl w:val="0"/>
-          <w:numId w:val="1003"/>
-        </w:numPr>
-      </w:pPr>
-      <w:r>
-        <w:t xml:space="preserve">ICC primary: 3-observer multi-rater ICC(2,1) on</w:t>
-      </w:r>
-      <w:r>
-        <w:t xml:space="preserve"> </w:t>
-      </w:r>
-      <w:r>
-        <w:rPr>
-          <w:b/>
-          <w:bCs/>
-        </w:rPr>
-        <w:t xml:space="preserve">n=46</w:t>
-      </w:r>
-      <w:r>
-        <w:t xml:space="preserve"> </w:t>
-      </w:r>
-      <w:r>
-        <w:t xml:space="preserve">(done); multilevel VC ICC reported; intra-observer S1/S2 only if data allow.</w:t>
-      </w:r>
-    </w:p>
-    <w:p>
-      <w:pPr>
-        <w:pStyle w:val="Compact"/>
-        <w:numPr>
-          <w:ilvl w:val="0"/>
-          <w:numId w:val="1003"/>
-        </w:numPr>
-      </w:pPr>
-      <w:r>
-        <w:t xml:space="preserve">Convert this file to PDF for “File 1: response to reviewers” after numbers are filled.</w:t>
-      </w:r>
-    </w:p>
     <w:bookmarkEnd w:id="23"/>
-    <w:bookmarkEnd w:id="24"/>
     <w:sectPr>
       <w:footnotePr>
         <w:numRestart w:val="eachSect"/>
@@ -3056,109 +4117,6 @@
       <w:pPr>
         <w:ind w:left="6480" w:hanging="360"/>
       </w:pPr>
-    </w:lvl>
-  </w:abstractNum>
-  <w:abstractNum w:abstractNumId="991">
-    <w:nsid w:val="0000A991"/>
-    <w:multiLevelType w:val="multilevel"/>
-    <w:lvl w:ilvl="0">
-      <w:numFmt w:val="bullet"/>
-      <w:lvlText w:val=""/>
-      <w:lvlJc w:val="left"/>
-      <w:pPr>
-        <w:ind w:left="720" w:hanging="360"/>
-      </w:pPr>
-      <w:rPr>
-        <w:rFonts w:ascii="Symbol" w:hAnsi="Symbol" w:cs="Symbol" w:hint="default"/>
-      </w:rPr>
-    </w:lvl>
-    <w:lvl w:ilvl="1">
-      <w:numFmt w:val="bullet"/>
-      <w:lvlText w:val="o"/>
-      <w:lvlJc w:val="left"/>
-      <w:pPr>
-        <w:ind w:left="1440" w:hanging="360"/>
-      </w:pPr>
-      <w:rPr>
-        <w:rFonts w:ascii="Courier New" w:hAnsi="Courier New" w:cs="Courier New" w:hint="default"/>
-      </w:rPr>
-    </w:lvl>
-    <w:lvl w:ilvl="2">
-      <w:numFmt w:val="bullet"/>
-      <w:lvlText w:val=""/>
-      <w:lvlJc w:val="left"/>
-      <w:pPr>
-        <w:ind w:left="2160" w:hanging="360"/>
-      </w:pPr>
-      <w:rPr>
-        <w:rFonts w:ascii="Wingdings" w:hAnsi="Wingdings" w:cs="Wingdings" w:hint="default"/>
-      </w:rPr>
-    </w:lvl>
-    <w:lvl w:ilvl="3">
-      <w:numFmt w:val="bullet"/>
-      <w:lvlText w:val=""/>
-      <w:lvlJc w:val="left"/>
-      <w:pPr>
-        <w:ind w:left="2880" w:hanging="360"/>
-      </w:pPr>
-      <w:rPr>
-        <w:rFonts w:ascii="Symbol" w:hAnsi="Symbol" w:cs="Symbol" w:hint="default"/>
-      </w:rPr>
-    </w:lvl>
-    <w:lvl w:ilvl="4">
-      <w:numFmt w:val="bullet"/>
-      <w:lvlText w:val="o"/>
-      <w:lvlJc w:val="left"/>
-      <w:pPr>
-        <w:ind w:left="3600" w:hanging="360"/>
-      </w:pPr>
-      <w:rPr>
-        <w:rFonts w:ascii="Courier New" w:hAnsi="Courier New" w:cs="Courier New" w:hint="default"/>
-      </w:rPr>
-    </w:lvl>
-    <w:lvl w:ilvl="5">
-      <w:numFmt w:val="bullet"/>
-      <w:lvlText w:val=""/>
-      <w:lvlJc w:val="left"/>
-      <w:pPr>
-        <w:ind w:left="4320" w:hanging="360"/>
-      </w:pPr>
-      <w:rPr>
-        <w:rFonts w:ascii="Wingdings" w:hAnsi="Wingdings" w:cs="Wingdings" w:hint="default"/>
-      </w:rPr>
-    </w:lvl>
-    <w:lvl w:ilvl="6">
-      <w:numFmt w:val="bullet"/>
-      <w:lvlText w:val=""/>
-      <w:lvlJc w:val="left"/>
-      <w:pPr>
-        <w:ind w:left="5040" w:hanging="360"/>
-      </w:pPr>
-      <w:rPr>
-        <w:rFonts w:ascii="Symbol" w:hAnsi="Symbol" w:cs="Symbol" w:hint="default"/>
-      </w:rPr>
-    </w:lvl>
-    <w:lvl w:ilvl="7">
-      <w:numFmt w:val="bullet"/>
-      <w:lvlText w:val="o"/>
-      <w:lvlJc w:val="left"/>
-      <w:pPr>
-        <w:ind w:left="5760" w:hanging="360"/>
-      </w:pPr>
-      <w:rPr>
-        <w:rFonts w:ascii="Courier New" w:hAnsi="Courier New" w:cs="Courier New" w:hint="default"/>
-      </w:rPr>
-    </w:lvl>
-    <w:lvl w:ilvl="8">
-      <w:numFmt w:val="bullet"/>
-      <w:lvlText w:val=""/>
-      <w:lvlJc w:val="left"/>
-      <w:pPr>
-        <w:ind w:left="6480" w:hanging="360"/>
-      </w:pPr>
-      <w:rPr>
-        <w:rFonts w:ascii="Wingdings" w:hAnsi="Wingdings" w:cs="Wingdings" w:hint="default"/>
-      </w:rPr>
     </w:lvl>
   </w:abstractNum>
   <w:num w:numId="1000">
@@ -3223,9 +4181,6 @@
     <w:lvlOverride w:ilvl="8">
       <w:startOverride w:val="1"/>
     </w:lvlOverride>
-  </w:num>
-  <w:num w:numId="1003">
-    <w:abstractNumId w:val="991"/>
   </w:num>
 </w:numbering>
 </file>

</xml_diff>